<commit_message>
Recheck: koreksi klaim Finding 1 ke basis SD-gap, sinkron angka ringkasan Phase 1, hapus klaim tak-terverifikasi & repetisi meta-komentar
</commit_message>
<xml_diff>
--- a/report/Knowledge_Discovery_Report.docx
+++ b/report/Knowledge_Discovery_Report.docx
@@ -433,7 +433,7 @@
           <w:b w:val="0"/>
           <w:i w:val="0"/>
         </w:rPr>
-        <w:t>Analisis KDD atas 2.260.668 pinjaman Lending Club menemukan bahwa risiko gagal bayar terkonsentrasi pada segmen mayoritas: 62,1 persen peminjam berada dalam satu segmen dengan tingkat charged-off 14,4 persen, hampir dua kali lipat segmen prime (7,8 persen), dan pembeda utamanya adalah penghasilan serta utilisasi kredit revolving, bukan skor FICO. Praktik penilaian yang bertumpu pada grade dan status outlier tidak menangkap hal ini: grade internal terbukti hampir sepenuhnya cerminan suku bunga (hanya 1 dari 1.023 aturan asosiasi yang memprediksi Grade A tanpa suku bunga), dan outlier statistik justru didominasi nasabah affluent yang membayar lancar (bad-rate 8,7 persen vs populasi 13,1 persen). Bank sebaiknya mengkalibrasi harga dan limit pada penghasilan dan utilisasi revolving, dan mengganti flag berbasis outlier dengan aturan kombinasi atribut tekanan kredit yang terbukti menaikkan risiko gagal bayar 1,47 kali (19,2 persen).</w:t>
+        <w:t>Analisis KDD atas 2.260.668 pinjaman Lending Club menemukan bahwa risiko gagal bayar terkonsentrasi pada segmen mayoritas: 62,1 persen peminjam berada dalam satu segmen dengan tingkat charged-off 14,4 persen, hampir dua kali lipat segmen prime (7,8 persen), dan segmen ini terpisah paling tajam pada kombinasi FICO, utilisasi revolving, dan ukuran pinjaman. Dua hal yang belum tercermin dalam praktik saat ini: grade internal hampir sepenuhnya cerminan suku bunga (hanya 1 dari 1.023 aturan asosiasi yang memprediksi Grade A tanpa suku bunga), dan outlier statistik justru didominasi nasabah affluent yang membayar lancar (bad-rate 8,7 persen vs populasi 13,1 persen). Bank sebaiknya mengkalibrasi harga dan limit pada kombinasi atribut tersebut, dan mengganti flag berbasis outlier dengan aturan kombinasi atribut tekanan kredit yang tervalidasi menaikkan risiko gagal bayar 1,47 kali (19,2 persen).</w:t>
       </w:r>
     </w:p>
     <w:p>
@@ -577,7 +577,7 @@
           <w:b w:val="0"/>
           <w:i w:val="0"/>
         </w:rPr>
-        <w:t>Segmentasi K-Means membelah populasi menjadi dua. Cluster 0 (dinamai Higher-risk) mencakup 62,1 persen peminjam dengan tingkat charged-off 14,4 persen; Cluster 1 (Prime) mencakup 37,9 persen dengan charged-off 7,8 persen. Tingkat di sini dihitung dari status Charged Off saja (rata-rata populasi 11,9 persen). Pembeda utama bukan FICO (684 berbanding 722), melainkan penghasilan tahunan (63 ribu berbanding 102 ribu dolar) dan utilisasi revolving (58 berbanding 37 persen).</w:t>
+        <w:t>Segmentasi K-Means membelah populasi menjadi dua. Cluster 0 (dinamai Higher-risk) mencakup 62,1 persen peminjam dengan tingkat charged-off 14,4 persen; Cluster 1 (Prime) mencakup 37,9 persen dengan charged-off 7,8 persen. Tingkat di sini dihitung dari status Charged Off saja (rata-rata populasi 11,9 persen). Dalam satuan simpangan baku (selisih z-score antar cluster, konsisten dengan radar profil Phase 2), pembeda paling tajam adalah FICO (1,15 SD; 684 berbanding 722), disusul ukuran pinjaman (0,87 SD; 12 ribu berbanding 20 ribu dolar) dan utilisasi revolving (0,85 SD; 58 berbanding 37 persen); gap penghasilan besar secara nominal (63 ribu berbanding 102 ribu dolar) tetapi hanya 0,35 SD karena varians penghasilan sangat lebar.</w:t>
       </w:r>
     </w:p>
     <w:p>
@@ -611,7 +611,7 @@
           <w:b w:val="0"/>
           <w:i w:val="0"/>
         </w:rPr>
-        <w:t>Intuisi umum menduga peminjam bermasalah adalah minoritas kecil. Data menunjukkan sebaliknya: hampir dua pertiga buku pinjaman berada di segmen yang lebih berisiko, dan pembedanya adalah kapasitas bayar serta tekanan kredit, bukan semata skor FICO.</w:t>
+        <w:t>Intuisi umum menduga peminjam bermasalah adalah minoritas kecil. Data menunjukkan sebaliknya: hampir dua pertiga buku pinjaman berada di segmen yang lebih berisiko, dan risiko itu terbaca dari beberapa atribut sekaligus, bukan satu skor tunggal: utilisasi revolving dan ukuran pinjaman menambah pemisahan hampir sebesar FICO.</w:t>
       </w:r>
     </w:p>
     <w:p>
@@ -628,7 +628,7 @@
           <w:b w:val="0"/>
           <w:i w:val="0"/>
         </w:rPr>
-        <w:t>Tim kebijakan kredit sebaiknya mengkalibrasi harga dan limit terhadap penghasilan dan utilisasi revolving, tidak bersandar pada FICO saja. Karena segmen Higher-risk berukuran besar, perbaikan kecil pada penetapan harga segmen ini berdampak jauh lebih besar pada kerugian portofolio dibanding menyaring minoritas ekor.</w:t>
+        <w:t>Tim kebijakan kredit sebaiknya mengkalibrasi harga dan limit pada kombinasi FICO, utilisasi revolving, dan ukuran pinjaman, bukan FICO tunggal. Karena segmen Higher-risk berukuran besar, perbaikan kecil pada penetapan harga segmen ini berdampak jauh lebih besar pada kerugian portofolio dibanding menyaring minoritas ekor.</w:t>
       </w:r>
     </w:p>
     <w:p>

</xml_diff>